<commit_message>
Make reference URLs clickable hyperlinks; fix Francis order
Co-Authored-By: Claude Sonnet 5.5 <noreply@anthropic.com>
Claude-Session: https://claude.ai/code/session_01Vjm9Ahpvedd54aqkLcW9LV
</commit_message>
<xml_diff>
--- a/portfolio/Professional Portfolio - Complete.docx
+++ b/portfolio/Professional Portfolio - Complete.docx
@@ -1893,7 +1893,25 @@
           <w:rFonts w:ascii="Arial" w:hAnsi="Arial"/>
           <w:sz w:val="24"/>
         </w:rPr>
-        <w:t>Care Act 2014. c. 23. Available at: https://www.legislation.gov.uk/ukpga/2014/23 (Accessed: [date]).</w:t>
+        <w:t xml:space="preserve">Care Act 2014. c. 23. Available at: </w:t>
+      </w:r>
+      <w:hyperlink r:id="rId9">
+        <w:r>
+          <w:rPr>
+            <w:rFonts w:ascii="Arial" w:hAnsi="Arial"/>
+            <w:color w:val="0563C1"/>
+            <w:u w:val="single"/>
+            <w:sz w:val="24"/>
+          </w:rPr>
+          <w:t>https://www.legislation.gov.uk/ukpga/2014/23</w:t>
+        </w:r>
+      </w:hyperlink>
+      <w:r>
+        <w:rPr>
+          <w:rFonts w:ascii="Arial" w:hAnsi="Arial"/>
+          <w:sz w:val="24"/>
+        </w:rPr>
+        <w:t xml:space="preserve"> (Accessed: [date]).</w:t>
       </w:r>
     </w:p>
     <w:p>
@@ -1926,7 +1944,25 @@
           <w:rFonts w:ascii="Arial" w:hAnsi="Arial"/>
           <w:sz w:val="24"/>
         </w:rPr>
-        <w:t>Data Protection Act 2018. c. 12. Available at: https://www.legislation.gov.uk/ukpga/2018/12 (Accessed: [date]).</w:t>
+        <w:t xml:space="preserve">Data Protection Act 2018. c. 12. Available at: </w:t>
+      </w:r>
+      <w:hyperlink r:id="rId10">
+        <w:r>
+          <w:rPr>
+            <w:rFonts w:ascii="Arial" w:hAnsi="Arial"/>
+            <w:color w:val="0563C1"/>
+            <w:u w:val="single"/>
+            <w:sz w:val="24"/>
+          </w:rPr>
+          <w:t>https://www.legislation.gov.uk/ukpga/2018/12</w:t>
+        </w:r>
+      </w:hyperlink>
+      <w:r>
+        <w:rPr>
+          <w:rFonts w:ascii="Arial" w:hAnsi="Arial"/>
+          <w:sz w:val="24"/>
+        </w:rPr>
+        <w:t xml:space="preserve"> (Accessed: [date]).</w:t>
       </w:r>
     </w:p>
     <w:p>
@@ -1935,7 +1971,25 @@
           <w:rFonts w:ascii="Arial" w:hAnsi="Arial"/>
           <w:sz w:val="24"/>
         </w:rPr>
-        <w:t>Data (Use and Access) Act 2025. Available at: https://www.legislation.gov.uk/ukpga/2025/18 (Accessed: [date]).</w:t>
+        <w:t xml:space="preserve">Data (Use and Access) Act 2025. Available at: </w:t>
+      </w:r>
+      <w:hyperlink r:id="rId11">
+        <w:r>
+          <w:rPr>
+            <w:rFonts w:ascii="Arial" w:hAnsi="Arial"/>
+            <w:color w:val="0563C1"/>
+            <w:u w:val="single"/>
+            <w:sz w:val="24"/>
+          </w:rPr>
+          <w:t>https://www.legislation.gov.uk/ukpga/2025/18</w:t>
+        </w:r>
+      </w:hyperlink>
+      <w:r>
+        <w:rPr>
+          <w:rFonts w:ascii="Arial" w:hAnsi="Arial"/>
+          <w:sz w:val="24"/>
+        </w:rPr>
+        <w:t xml:space="preserve"> (Accessed: [date]).</w:t>
       </w:r>
     </w:p>
     <w:p>
@@ -2088,7 +2142,7 @@
           <w:rFonts w:ascii="Arial" w:hAnsi="Arial"/>
           <w:sz w:val="24"/>
         </w:rPr>
-        <w:t xml:space="preserve">Francis, R. (2015) </w:t>
+        <w:t xml:space="preserve">Francis, R. (2013) </w:t>
       </w:r>
       <w:r>
         <w:rPr>
@@ -2096,14 +2150,14 @@
           <w:i/>
           <w:sz w:val="24"/>
         </w:rPr>
-        <w:t>Freedom to speak up: an independent review into creating an open and honest reporting culture in the NHS</w:t>
-      </w:r>
-      <w:r>
-        <w:rPr>
-          <w:rFonts w:ascii="Arial" w:hAnsi="Arial"/>
-          <w:sz w:val="24"/>
-        </w:rPr>
-        <w:t>. London: Freedom to Speak Up.</w:t>
+        <w:t>Report of the Mid Staffordshire NHS Foundation Trust Public Inquiry</w:t>
+      </w:r>
+      <w:r>
+        <w:rPr>
+          <w:rFonts w:ascii="Arial" w:hAnsi="Arial"/>
+          <w:sz w:val="24"/>
+        </w:rPr>
+        <w:t>. London: The Stationery Office.</w:t>
       </w:r>
     </w:p>
     <w:p>
@@ -2112,7 +2166,7 @@
           <w:rFonts w:ascii="Arial" w:hAnsi="Arial"/>
           <w:sz w:val="24"/>
         </w:rPr>
-        <w:t xml:space="preserve">Francis, R. (2013) </w:t>
+        <w:t xml:space="preserve">Francis, R. (2015) </w:t>
       </w:r>
       <w:r>
         <w:rPr>
@@ -2120,14 +2174,14 @@
           <w:i/>
           <w:sz w:val="24"/>
         </w:rPr>
-        <w:t>Report of the Mid Staffordshire NHS Foundation Trust Public Inquiry</w:t>
-      </w:r>
-      <w:r>
-        <w:rPr>
-          <w:rFonts w:ascii="Arial" w:hAnsi="Arial"/>
-          <w:sz w:val="24"/>
-        </w:rPr>
-        <w:t>. London: The Stationery Office.</w:t>
+        <w:t>Freedom to speak up: an independent review into creating an open and honest reporting culture in the NHS</w:t>
+      </w:r>
+      <w:r>
+        <w:rPr>
+          <w:rFonts w:ascii="Arial" w:hAnsi="Arial"/>
+          <w:sz w:val="24"/>
+        </w:rPr>
+        <w:t>. London: Freedom to Speak Up.</w:t>
       </w:r>
     </w:p>
     <w:p>
@@ -2256,7 +2310,25 @@
           <w:rFonts w:ascii="Arial" w:hAnsi="Arial"/>
           <w:sz w:val="24"/>
         </w:rPr>
-        <w:t>Health and Social Care Act 2008 (Regulated Activities) Regulations 2014. SI 2014/2936. Available at: https://www.legislation.gov.uk/uksi/2014/2936 (Accessed: [date]).</w:t>
+        <w:t xml:space="preserve">Health and Social Care Act 2008 (Regulated Activities) Regulations 2014. SI 2014/2936. Available at: </w:t>
+      </w:r>
+      <w:hyperlink r:id="rId12">
+        <w:r>
+          <w:rPr>
+            <w:rFonts w:ascii="Arial" w:hAnsi="Arial"/>
+            <w:color w:val="0563C1"/>
+            <w:u w:val="single"/>
+            <w:sz w:val="24"/>
+          </w:rPr>
+          <w:t>https://www.legislation.gov.uk/uksi/2014/2936</w:t>
+        </w:r>
+      </w:hyperlink>
+      <w:r>
+        <w:rPr>
+          <w:rFonts w:ascii="Arial" w:hAnsi="Arial"/>
+          <w:sz w:val="24"/>
+        </w:rPr>
+        <w:t xml:space="preserve"> (Accessed: [date]).</w:t>
       </w:r>
     </w:p>
     <w:p>
@@ -2280,7 +2352,25 @@
           <w:rFonts w:ascii="Arial" w:hAnsi="Arial"/>
           <w:sz w:val="24"/>
         </w:rPr>
-        <w:t>. Available at: https://www.gov.uk/graduate-visa (Accessed: [date]).</w:t>
+        <w:t xml:space="preserve">. Available at: </w:t>
+      </w:r>
+      <w:hyperlink r:id="rId13">
+        <w:r>
+          <w:rPr>
+            <w:rFonts w:ascii="Arial" w:hAnsi="Arial"/>
+            <w:color w:val="0563C1"/>
+            <w:u w:val="single"/>
+            <w:sz w:val="24"/>
+          </w:rPr>
+          <w:t>https://www.gov.uk/graduate-visa</w:t>
+        </w:r>
+      </w:hyperlink>
+      <w:r>
+        <w:rPr>
+          <w:rFonts w:ascii="Arial" w:hAnsi="Arial"/>
+          <w:sz w:val="24"/>
+        </w:rPr>
+        <w:t xml:space="preserve"> (Accessed: [date]).</w:t>
       </w:r>
     </w:p>
     <w:p>
@@ -2304,7 +2394,25 @@
           <w:rFonts w:ascii="Arial" w:hAnsi="Arial"/>
           <w:sz w:val="24"/>
         </w:rPr>
-        <w:t>. Available at: https://ico.org.uk (Accessed: [date]).</w:t>
+        <w:t xml:space="preserve">. Available at: </w:t>
+      </w:r>
+      <w:hyperlink r:id="rId14">
+        <w:r>
+          <w:rPr>
+            <w:rFonts w:ascii="Arial" w:hAnsi="Arial"/>
+            <w:color w:val="0563C1"/>
+            <w:u w:val="single"/>
+            <w:sz w:val="24"/>
+          </w:rPr>
+          <w:t>https://ico.org.uk</w:t>
+        </w:r>
+      </w:hyperlink>
+      <w:r>
+        <w:rPr>
+          <w:rFonts w:ascii="Arial" w:hAnsi="Arial"/>
+          <w:sz w:val="24"/>
+        </w:rPr>
+        <w:t xml:space="preserve"> (Accessed: [date]).</w:t>
       </w:r>
     </w:p>
     <w:p>
@@ -2385,7 +2493,25 @@
           <w:rFonts w:ascii="Arial" w:hAnsi="Arial"/>
           <w:sz w:val="24"/>
         </w:rPr>
-        <w:t>Medical Devices Regulations 2002. SI 2002/618. Available at: https://www.legislation.gov.uk/uksi/2002/618 (Accessed: [date]).</w:t>
+        <w:t xml:space="preserve">Medical Devices Regulations 2002. SI 2002/618. Available at: </w:t>
+      </w:r>
+      <w:hyperlink r:id="rId15">
+        <w:r>
+          <w:rPr>
+            <w:rFonts w:ascii="Arial" w:hAnsi="Arial"/>
+            <w:color w:val="0563C1"/>
+            <w:u w:val="single"/>
+            <w:sz w:val="24"/>
+          </w:rPr>
+          <w:t>https://www.legislation.gov.uk/uksi/2002/618</w:t>
+        </w:r>
+      </w:hyperlink>
+      <w:r>
+        <w:rPr>
+          <w:rFonts w:ascii="Arial" w:hAnsi="Arial"/>
+          <w:sz w:val="24"/>
+        </w:rPr>
+        <w:t xml:space="preserve"> (Accessed: [date]).</w:t>
       </w:r>
     </w:p>
     <w:p>
@@ -2409,7 +2535,25 @@
           <w:rFonts w:ascii="Arial" w:hAnsi="Arial"/>
           <w:sz w:val="24"/>
         </w:rPr>
-        <w:t>. Available at: https://www.gov.uk (Accessed: [date]).</w:t>
+        <w:t xml:space="preserve">. Available at: </w:t>
+      </w:r>
+      <w:hyperlink r:id="rId16">
+        <w:r>
+          <w:rPr>
+            <w:rFonts w:ascii="Arial" w:hAnsi="Arial"/>
+            <w:color w:val="0563C1"/>
+            <w:u w:val="single"/>
+            <w:sz w:val="24"/>
+          </w:rPr>
+          <w:t>https://www.gov.uk</w:t>
+        </w:r>
+      </w:hyperlink>
+      <w:r>
+        <w:rPr>
+          <w:rFonts w:ascii="Arial" w:hAnsi="Arial"/>
+          <w:sz w:val="24"/>
+        </w:rPr>
+        <w:t xml:space="preserve"> (Accessed: [date]).</w:t>
       </w:r>
     </w:p>
     <w:p>
@@ -2418,7 +2562,25 @@
           <w:rFonts w:ascii="Arial" w:hAnsi="Arial"/>
           <w:sz w:val="24"/>
         </w:rPr>
-        <w:t>Mental Capacity Act 2005. c. 9. Available at: https://www.legislation.gov.uk/ukpga/2005/9 (Accessed: [date]).</w:t>
+        <w:t xml:space="preserve">Mental Capacity Act 2005. c. 9. Available at: </w:t>
+      </w:r>
+      <w:hyperlink r:id="rId17">
+        <w:r>
+          <w:rPr>
+            <w:rFonts w:ascii="Arial" w:hAnsi="Arial"/>
+            <w:color w:val="0563C1"/>
+            <w:u w:val="single"/>
+            <w:sz w:val="24"/>
+          </w:rPr>
+          <w:t>https://www.legislation.gov.uk/ukpga/2005/9</w:t>
+        </w:r>
+      </w:hyperlink>
+      <w:r>
+        <w:rPr>
+          <w:rFonts w:ascii="Arial" w:hAnsi="Arial"/>
+          <w:sz w:val="24"/>
+        </w:rPr>
+        <w:t xml:space="preserve"> (Accessed: [date]).</w:t>
       </w:r>
     </w:p>
     <w:p>
@@ -2634,7 +2796,25 @@
           <w:rFonts w:ascii="Arial" w:hAnsi="Arial"/>
           <w:sz w:val="24"/>
         </w:rPr>
-        <w:t>. Available at: https://www.nmc.org.uk (Accessed: [date]).</w:t>
+        <w:t xml:space="preserve">. Available at: </w:t>
+      </w:r>
+      <w:hyperlink r:id="rId18">
+        <w:r>
+          <w:rPr>
+            <w:rFonts w:ascii="Arial" w:hAnsi="Arial"/>
+            <w:color w:val="0563C1"/>
+            <w:u w:val="single"/>
+            <w:sz w:val="24"/>
+          </w:rPr>
+          <w:t>https://www.nmc.org.uk</w:t>
+        </w:r>
+      </w:hyperlink>
+      <w:r>
+        <w:rPr>
+          <w:rFonts w:ascii="Arial" w:hAnsi="Arial"/>
+          <w:sz w:val="24"/>
+        </w:rPr>
+        <w:t xml:space="preserve"> (Accessed: [date]).</w:t>
       </w:r>
     </w:p>
     <w:p>
@@ -2922,7 +3102,25 @@
           <w:rFonts w:ascii="Arial" w:hAnsi="Arial"/>
           <w:sz w:val="24"/>
         </w:rPr>
-        <w:t>. Available at: https://www.skillsforcare.org.uk (Accessed: [date]).</w:t>
+        <w:t xml:space="preserve">. Available at: </w:t>
+      </w:r>
+      <w:hyperlink r:id="rId19">
+        <w:r>
+          <w:rPr>
+            <w:rFonts w:ascii="Arial" w:hAnsi="Arial"/>
+            <w:color w:val="0563C1"/>
+            <w:u w:val="single"/>
+            <w:sz w:val="24"/>
+          </w:rPr>
+          <w:t>https://www.skillsforcare.org.uk</w:t>
+        </w:r>
+      </w:hyperlink>
+      <w:r>
+        <w:rPr>
+          <w:rFonts w:ascii="Arial" w:hAnsi="Arial"/>
+          <w:sz w:val="24"/>
+        </w:rPr>
+        <w:t xml:space="preserve"> (Accessed: [date]).</w:t>
       </w:r>
     </w:p>
     <w:p>
@@ -3003,7 +3201,25 @@
           <w:rFonts w:ascii="Arial" w:hAnsi="Arial"/>
           <w:sz w:val="24"/>
         </w:rPr>
-        <w:t>UK General Data Protection Regulation. Retained Regulation (EU) 2016/679. Available at: https://www.legislation.gov.uk/eur/2016/679 (Accessed: [date]).</w:t>
+        <w:t xml:space="preserve">UK General Data Protection Regulation. Retained Regulation (EU) 2016/679. Available at: </w:t>
+      </w:r>
+      <w:hyperlink r:id="rId20">
+        <w:r>
+          <w:rPr>
+            <w:rFonts w:ascii="Arial" w:hAnsi="Arial"/>
+            <w:color w:val="0563C1"/>
+            <w:u w:val="single"/>
+            <w:sz w:val="24"/>
+          </w:rPr>
+          <w:t>https://www.legislation.gov.uk/eur/2016/679</w:t>
+        </w:r>
+      </w:hyperlink>
+      <w:r>
+        <w:rPr>
+          <w:rFonts w:ascii="Arial" w:hAnsi="Arial"/>
+          <w:sz w:val="24"/>
+        </w:rPr>
+        <w:t xml:space="preserve"> (Accessed: [date]).</w:t>
       </w:r>
     </w:p>
     <w:p>

</xml_diff>

<commit_message>
Harvard consistency: et al. for 3+ authors, define MHRA at first use
Co-Authored-By: Claude Sonnet 5.5 <noreply@anthropic.com>
Claude-Session: https://claude.ai/code/session_01Vjm9Ahpvedd54aqkLcW9LV
</commit_message>
<xml_diff>
--- a/portfolio/Professional Portfolio - Complete.docx
+++ b/portfolio/Professional Portfolio - Complete.docx
@@ -202,7 +202,7 @@
           <w:rFonts w:ascii="Arial" w:hAnsi="Arial"/>
           <w:sz w:val="24"/>
         </w:rPr>
-        <w:t>Gibbs (1988) is structured and accessible, but is criticised as descriptive and weak on critique (Finlay, 2008). Schön (1983) captures reflection-in-action, which is hard to evidence in writing (Finlay, 2008). Rolfe, Freshwater and Jasper (2001) are simple but can stay shallow. I use Gibbs as a spine and compensate by pairing each stage with evidence and an explicit judgement, borrowing Schön for moments of intuition (2.2). Evidence-based practice has similar limits: Sackett et al. (1996) rely on a hierarchy of evidence that Greenhalgh, Howick and Maskrey (2014) argue fits poorly with complex, person-centred care, so I grade each source by what it can show. I map my competencies to the Care Certificate standards (Skills for Care, Health Education England and Skills for Health, 2015) and the Healthcare Leadership Model (NHS Leadership Academy, 2013), remembering that a record of attendance is not competence (3.2).</w:t>
+        <w:t>Gibbs (1988) is structured and accessible, but is criticised as descriptive and weak on critique (Finlay, 2008). Schön (1983) captures reflection-in-action, which is hard to evidence in writing (Finlay, 2008). Rolfe et al. (2001) are simple but can stay shallow. I use Gibbs as a spine and compensate by pairing each stage with evidence and an explicit judgement, borrowing Schön for moments of intuition (2.2). Evidence-based practice has similar limits: Sackett et al. (1996) rely on a hierarchy of evidence that Greenhalgh et al. (2014) argue fits poorly with complex, person-centred care, so I grade each source by what it can show. I map my competencies to the Care Certificate standards (Skills for Care, Health Education England and Skills for Health, 2015) and the Healthcare Leadership Model (NHS Leadership Academy, 2013), remembering that a record of attendance is not competence (3.2).</w:t>
       </w:r>
     </w:p>
     <w:p>
@@ -253,7 +253,7 @@
           <w:rFonts w:ascii="Arial" w:hAnsi="Arial"/>
           <w:sz w:val="24"/>
         </w:rPr>
-        <w:t>AI in diagnostics is live NHS policy. NHSX (2019) set out how to adopt it safely, and the Department of Health and Social Care (2025) anticipates wider use. Yet no statute regulates healthcare AI as such: software with a medical purpose is regulated as a medical device (Medical Devices Regulations 2002; MHRA, 2023), while safe local use falls to clinical safety standards and provider governance (NHS England, 2018). Whether this combination protects patients adequately is contestable. The case matters because it sits where policy ambition meets the least experienced person on the ward.</w:t>
+        <w:t>AI in diagnostics is live NHS policy. NHSX (2019) set out how to adopt it safely, and the Department of Health and Social Care (2025) anticipates wider use. Yet no statute regulates healthcare AI as such: software with a medical purpose is regulated as a medical device (Medical Devices Regulations 2002; Medicines and Healthcare products Regulatory Agency [MHRA], 2023), while safe local use falls to clinical safety standards and provider governance (NHS England, 2018). Whether this combination protects patients adequately is contestable. The case matters because it sits where policy ambition meets the least experienced person on the ward.</w:t>
       </w:r>
     </w:p>
     <w:p>
@@ -321,7 +321,7 @@
           <w:rFonts w:ascii="Arial" w:hAnsi="Arial"/>
           <w:sz w:val="24"/>
         </w:rPr>
-        <w:t xml:space="preserve"> Three mechanisms matter. First, automation bias: people over-rely on automated advice, missing errors the tool misses and following errors it makes (Parasuraman and Manzey, 2010). Goddard, Roudsari and Wyatt (2012) reviewed evidence that clinicians can follow incorrect advice, with mixed evidence on mitigations such as training. In mammography, Dratsch et al. (2023) found that incorrect AI suggestions lowered reader accuracy, especially for less experienced readers. Second, anchoring: an early value shapes later judgement (Tversky and Kahneman, 1974), and a flag displayed first is such a value. Third, performance does not travel automatically. Seyyed-Kalantari et al. (2021) found that chest radiograph algorithms underdiagnosed some under-served groups, so published accuracy may not describe a particular ward. These studies concern radiology readers or retrospective datasets, not students documenting on a ward, so they support caution, not prediction. In my situation the relevant risk was error propagation: a flag copied into a record may later be read as a clinician's finding. Anchoring meant a flag could shape what I wrote even if I doubted it, and automation bias meant that a student, deferring to both the tool and the hierarchy, may be the person least likely to question it.</w:t>
+        <w:t xml:space="preserve"> Three mechanisms matter. First, automation bias: people over-rely on automated advice, missing errors the tool misses and following errors it makes (Parasuraman and Manzey, 2010). Goddard et al. (2012) reviewed evidence that clinicians can follow incorrect advice, with mixed evidence on mitigations such as training. In mammography, Dratsch et al. (2023) found that incorrect AI suggestions lowered reader accuracy, especially for less experienced readers. Second, anchoring: an early value shapes later judgement (Tversky and Kahneman, 1974), and a flag displayed first is such a value. Third, performance does not travel automatically. Seyyed-Kalantari et al. (2021) found that chest radiograph algorithms underdiagnosed some under-served groups, so published accuracy may not describe a particular ward. These studies concern radiology readers or retrospective datasets, not students documenting on a ward, so they support caution, not prediction. In my situation the relevant risk was error propagation: a flag copied into a record may later be read as a clinician's finding. Anchoring meant a flag could shape what I wrote even if I doubted it, and automation bias meant that a student, deferring to both the tool and the hierarchy, may be the person least likely to question it.</w:t>
       </w:r>
     </w:p>
     <w:p>
@@ -355,7 +355,7 @@
           <w:rFonts w:ascii="Arial" w:hAnsi="Arial"/>
           <w:sz w:val="24"/>
         </w:rPr>
-        <w:t xml:space="preserve"> Diagnostic software is normally regulated as a medical device under the Medical Devices Regulations 2002 (as amended), with guidance from the Medicines and Healthcare products Regulatory Agency (MHRA, 2023). The clinical safety standards DCB0129 (manufacturers) and DCB0160 (deploying organisations) require clinical risk management (NHS England, 2018). Providers must deliver safe care and treatment and operate good governance under Regulations 12 and 17 of the Health and Social Care Act 2008 (Regulated Activities) Regulations 2014. I do not know how the tool or the ward met these requirements and do not suggest they were unmet. My critical point is structural: this regime approves a product and requires local risk management, but safe use still depends on staff who understand the tool's limits, and nothing I know of requires that a placement student is told them. Regulation sits upstream of the moment I met the tool; the moment itself was governed by local practice.</w:t>
+        <w:t xml:space="preserve"> Diagnostic software is normally regulated as a medical device under the Medical Devices Regulations 2002 (as amended), with guidance from the MHRA (2023). The clinical safety standards DCB0129 (manufacturers) and DCB0160 (deploying organisations) require clinical risk management (NHS England, 2018). Providers must deliver safe care and treatment and operate good governance under Regulations 12 and 17 of the Health and Social Care Act 2008 (Regulated Activities) Regulations 2014. I do not know how the tool or the ward met these requirements and do not suggest they were unmet. My critical point is structural: this regime approves a product and requires local risk management, but safe use still depends on staff who understand the tool's limits, and nothing I know of requires that a placement student is told them. Regulation sits upstream of the moment I met the tool; the moment itself was governed by local practice.</w:t>
       </w:r>
     </w:p>
     <w:p>
@@ -431,7 +431,7 @@
           <w:rFonts w:ascii="Arial" w:hAnsi="Arial"/>
           <w:sz w:val="24"/>
         </w:rPr>
-        <w:t xml:space="preserve"> SBAR gives structure: situation, background, assessment, recommendation (Haig, Sutton and Whittington, 2006). Applied here, it would have turned a feeling into a message: the flag appeared inconsistent; I was completing documentation; I could not say why; please check. A systematic review found the evidence for SBAR to be mostly low-quality studies of hospital settings (Müller et al., 2018), so I treat it as a useful prompt, not proof of safer care. Nancarrow et al. (2013) describe good interdisciplinary teamwork through clear roles, communication and mutual respect, and Reeves et al. (2017) found the evidence on interprofessional collaboration limited and varied. Transfer from those studies to a student querying an AI output is my inference, not a finding.</w:t>
+        <w:t xml:space="preserve"> SBAR gives structure: situation, background, assessment, recommendation (Haig et al., 2006). Applied here, it would have turned a feeling into a message: the flag appeared inconsistent; I was completing documentation; I could not say why; please check. A systematic review found the evidence for SBAR to be mostly low-quality studies of hospital settings (Müller et al., 2018), so I treat it as a useful prompt, not proof of safer care. Nancarrow et al. (2013) describe good interdisciplinary teamwork through clear roles, communication and mutual respect, and Reeves et al. (2017) found the evidence on interprofessional collaboration limited and varied. Transfer from those studies to a student querying an AI output is my inference, not a finding.</w:t>
       </w:r>
     </w:p>
     <w:p>

</xml_diff>